<commit_message>
templates mẫu hợp đồng, biên nhận, phiếu thu
</commit_message>
<xml_diff>
--- a/backend/templates/bien-ban-giao-nhan-tai-san.docx
+++ b/backend/templates/bien-ban-giao-nhan-tai-san.docx
@@ -954,20 +954,12 @@
     </w:p>
     <w:tbl>
       <w:tblPr>
-        <w:tblpPr w:leftFromText="180" w:rightFromText="180" w:vertAnchor="text" w:horzAnchor="page" w:tblpX="7738" w:tblpY="16"/>
-        <w:tblW w:w="3345" w:type="dxa"/>
-        <w:tblBorders>
-          <w:top w:val="single" w:sz="4" w:space="0" w:color="auto"/>
-          <w:left w:val="single" w:sz="4" w:space="0" w:color="auto"/>
-          <w:bottom w:val="single" w:sz="4" w:space="0" w:color="auto"/>
-          <w:right w:val="single" w:sz="4" w:space="0" w:color="auto"/>
-          <w:insideH w:val="single" w:sz="4" w:space="0" w:color="auto"/>
-          <w:insideV w:val="single" w:sz="4" w:space="0" w:color="auto"/>
-        </w:tblBorders>
+        <w:tblpPr w:leftFromText="180" w:rightFromText="180" w:vertAnchor="text" w:horzAnchor="page" w:tblpX="6653" w:tblpY="16"/>
+        <w:tblW w:w="4430" w:type="dxa"/>
         <w:tblLook w:val="0000" w:firstRow="0" w:lastRow="0" w:firstColumn="0" w:lastColumn="0" w:noHBand="0" w:noVBand="0"/>
       </w:tblPr>
       <w:tblGrid>
-        <w:gridCol w:w="3345"/>
+        <w:gridCol w:w="4430"/>
       </w:tblGrid>
       <w:tr>
         <w:trPr>
@@ -976,13 +968,7 @@
         </w:trPr>
         <w:tc>
           <w:tcPr>
-            <w:tcW w:w="3345" w:type="dxa"/>
-            <w:tcBorders>
-              <w:top w:val="nil"/>
-              <w:left w:val="nil"/>
-              <w:bottom w:val="nil"/>
-              <w:right w:val="nil"/>
-            </w:tcBorders>
+            <w:tcW w:w="4430" w:type="dxa"/>
           </w:tcPr>
           <w:p>
             <w:pPr>
@@ -997,9 +983,8 @@
             <w:r>
               <w:t xml:space="preserve"> </w:t>
             </w:r>
-            <w:proofErr w:type="gramStart"/>
             <w:r>
-              <w:t>…,</w:t>
+              <w:t xml:space="preserve">{day}, </w:t>
             </w:r>
             <w:proofErr w:type="spellStart"/>
             <w:r>
@@ -1007,11 +992,21 @@
             </w:r>
             <w:proofErr w:type="spellEnd"/>
             <w:r>
-              <w:t>…,Năm</w:t>
+              <w:t xml:space="preserve"> {month</w:t>
+            </w:r>
+            <w:proofErr w:type="gramStart"/>
+            <w:r>
+              <w:t xml:space="preserve">} </w:t>
+            </w:r>
+            <w:r>
+              <w:t>,Nă</w:t>
+            </w:r>
+            <w:r>
+              <w:t>m</w:t>
             </w:r>
             <w:proofErr w:type="gramEnd"/>
             <w:r>
-              <w:t>…</w:t>
+              <w:t xml:space="preserve"> {year}</w:t>
             </w:r>
           </w:p>
           <w:p>
@@ -1052,27 +1047,7 @@
                 <w:sz w:val="28"/>
                 <w:szCs w:val="28"/>
               </w:rPr>
-              <w:t xml:space="preserve"> </w:t>
-            </w:r>
-            <w:proofErr w:type="spellStart"/>
-            <w:r>
-              <w:rPr>
-                <w:b/>
-                <w:bCs/>
-                <w:sz w:val="28"/>
-                <w:szCs w:val="28"/>
-              </w:rPr>
-              <w:t>cửa</w:t>
-            </w:r>
-            <w:proofErr w:type="spellEnd"/>
-            <w:r>
-              <w:rPr>
-                <w:b/>
-                <w:bCs/>
-                <w:sz w:val="28"/>
-                <w:szCs w:val="28"/>
-              </w:rPr>
-              <w:t xml:space="preserve"> </w:t>
+              <w:t xml:space="preserve"> cửa </w:t>
             </w:r>
             <w:proofErr w:type="spellStart"/>
             <w:r>

</xml_diff>